<commit_message>
Online first: sign-up page, site, FAQ hub, taster, tutor guide, K2 check and What Learners Get; workbook and kit posted home
Co-Authored-By: Claude Opus 5.5 <noreply@anthropic.com>
Claude-Session: https://claude.ai/code/session_01NYgB3ju57UwWRpkPPM6X7F
</commit_message>
<xml_diff>
--- a/outputs/designed/Math_Inquirers_P1_Tutor_Guide.docx
+++ b/outputs/designed/Math_Inquirers_P1_Tutor_Guide.docx
@@ -63,7 +63,7 @@
           <w:sz w:val="21"/>
           <w:szCs w:val="21"/>
         </w:rPr>
-        <w:t xml:space="preserve">Program guide for tutors: schedule, lesson routine, ten minute-by-minute lesson scripts with answer keys, a progress tracker and a parent summary. Everything works face to face or online.</w:t>
+        <w:t xml:space="preserve">Program guide for tutors: schedule, lesson routine, ten minute-by-minute lesson scripts with answer keys, a progress tracker and a parent summary. Math Inquirers is online first: every lesson runs live on video; the face-to-face notes are kept for partner centres.</w:t>
       </w:r>
     </w:p>
     <w:p>
@@ -317,7 +317,7 @@
                 <w:sz w:val="20"/>
                 <w:szCs w:val="20"/>
               </w:rPr>
-              <w:t xml:space="preserve">Up to 8 children per tutor, face to face or online. Pilot with 6. Add a second tutor or helper above 8.</w:t>
+              <w:t xml:space="preserve">Up to 8 children per tutor, live online. Pilot with 6. Add a second tutor or helper above 8.</w:t>
             </w:r>
           </w:p>
         </w:tc>

</xml_diff>

<commit_message>
Sign-up pages: safe enrichment wording, design section, GEP disclaimers kept
Co-Authored-By: Claude Sonnet 5.5 <noreply@anthropic.com>
Claude-Session: https://claude.ai/code/session_01NYgB3ju57UwWRpkPPM6X7F
</commit_message>
<xml_diff>
--- a/outputs/designed/Math_Inquirers_P1_Tutor_Guide.docx
+++ b/outputs/designed/Math_Inquirers_P1_Tutor_Guide.docx
@@ -9817,7 +9817,7 @@
                 <w:sz w:val="20"/>
                 <w:szCs w:val="20"/>
               </w:rPr>
-              <w:t xml:space="preserve">34 and 22. Take away 6.</w:t>
+              <w:t xml:space="preserve">34 and 22. Take away 6 (use the two neighbours 16 and 10).</w:t>
             </w:r>
           </w:p>
         </w:tc>
@@ -9855,7 +9855,7 @@
                 <w:sz w:val="20"/>
                 <w:szCs w:val="20"/>
               </w:rPr>
-              <w:t xml:space="preserve">Workbook Think Harder T3: A pattern starts at 3 and adds 5 each time. What is the 8th number?</w:t>
+              <w:t xml:space="preserve">Workbook Think Harder T3: Is 30 in the pattern 4, 8, 12, 16 … ? How do you know?</w:t>
             </w:r>
           </w:p>
         </w:tc>
@@ -9888,7 +9888,7 @@
                 <w:sz w:val="20"/>
                 <w:szCs w:val="20"/>
               </w:rPr>
-              <w:t xml:space="preserve">38</w:t>
+              <w:t xml:space="preserve">No. The pattern goes 28, 32, so it skips 30.</w:t>
             </w:r>
           </w:p>
         </w:tc>
@@ -9926,7 +9926,7 @@
                 <w:sz w:val="20"/>
                 <w:szCs w:val="20"/>
               </w:rPr>
-              <w:t xml:space="preserve">Workbook Think Harder T4: A pattern starts at 2 and adds 4 each time. What is the 7th number?</w:t>
+              <w:t xml:space="preserve">Workbook Think Harder T4: Start at 50 and take away 7 each time. What is the first number below 20?</w:t>
             </w:r>
           </w:p>
         </w:tc>
@@ -9959,7 +9959,7 @@
                 <w:sz w:val="20"/>
                 <w:szCs w:val="20"/>
               </w:rPr>
-              <w:t xml:space="preserve">26</w:t>
+              <w:t xml:space="preserve">15 (50, 43, 36, 29, 22, 15).</w:t>
             </w:r>
           </w:p>
         </w:tc>
@@ -9997,7 +9997,7 @@
                 <w:sz w:val="20"/>
                 <w:szCs w:val="20"/>
               </w:rPr>
-              <w:t xml:space="preserve">Workbook Challenge C1: Frog A starts at 3 and jumps 4 each time. Frog B starts at 5 and jumps 3 each time. Which numbers up to 40 do both frogs land on?</w:t>
+              <w:t xml:space="preserve">Workbook Challenge C1: 1, 2, 4, 7, 11, 16 … What is the 8th number? Explain how the pattern grows.</w:t>
             </w:r>
           </w:p>
         </w:tc>
@@ -10030,7 +10030,7 @@
                 <w:sz w:val="20"/>
                 <w:szCs w:val="20"/>
               </w:rPr>
-              <w:t xml:space="preserve">11, 23 and 35.</w:t>
+              <w:t xml:space="preserve">29. The gaps are 1, 2, 3, 4, 5, 6, 7, so the 7th is 22 and the 8th is 29.</w:t>
             </w:r>
           </w:p>
         </w:tc>
@@ -10068,7 +10068,7 @@
                 <w:sz w:val="20"/>
                 <w:szCs w:val="20"/>
               </w:rPr>
-              <w:t xml:space="preserve">Workbook Challenge C2: 1, 2, 4, 7, 11, 16 … What is the 8th number? Explain how the pattern grows.</w:t>
+              <w:t xml:space="preserve">Workbook Challenge C2: Ali counts up from 2 in 3s. Mei counts up from 1 in 4s. Which numbers up to 50 are in both patterns? What do you notice about the gaps between them?</w:t>
             </w:r>
           </w:p>
         </w:tc>
@@ -10101,7 +10101,7 @@
                 <w:sz w:val="20"/>
                 <w:szCs w:val="20"/>
               </w:rPr>
-              <w:t xml:space="preserve">29. The gaps are 1, 2, 3, 4, 5, 6, 7, so the 7th is 22 and the 8th is 29.</w:t>
+              <w:t xml:space="preserve">5, 17, 29 and 41. Each one is 12 more than the one before.</w:t>
             </w:r>
           </w:p>
         </w:tc>
@@ -10139,7 +10139,7 @@
                 <w:sz w:val="20"/>
                 <w:szCs w:val="20"/>
               </w:rPr>
-              <w:t xml:space="preserve">Workbook Challenge C3: Ali counts up from 2 in 3s. Mei counts up from 1 in 4s. Which numbers up to 50 are in both patterns?</w:t>
+              <w:t xml:space="preserve">Workbook Challenge C3: Make up your own two counting patterns: choose a start and a jump for each, so that they share some numbers up to 50. Write both patterns and ring the shared numbers. What do you notice about the gaps between the shared numbers?</w:t>
             </w:r>
           </w:p>
         </w:tc>
@@ -10172,7 +10172,7 @@
                 <w:sz w:val="20"/>
                 <w:szCs w:val="20"/>
               </w:rPr>
-              <w:t xml:space="preserve">5, 17, 29 and 41.</w:t>
+              <w:t xml:space="preserve">Open. Check by writing both lists and ringing the matches. Example: start 2 add 4 (2, 6, 10 …) and start 3 add 3 (3, 6, 9 …) share 6, 18, 30 and 42, with a gap of 12 each time.</w:t>
             </w:r>
           </w:p>
         </w:tc>
@@ -11012,7 +11012,7 @@
           <w:sz w:val="20"/>
           <w:szCs w:val="20"/>
         </w:rPr>
-        <w:t xml:space="preserve">1) Yes to 39, no to 40  2) 6  3) Add 4; the 1st number is 3</w:t>
+        <w:t xml:space="preserve">1) Yes to 39, no to 40  2) 22 does not belong; it should be 20  3) Add 4; the 1st number is 3</w:t>
       </w:r>
     </w:p>
     <w:p>
@@ -13897,7 +13897,7 @@
                 <w:sz w:val="20"/>
                 <w:szCs w:val="20"/>
               </w:rPr>
-              <w:t xml:space="preserve">Workbook Think Harder T2: 8 + 2 = 7 + __</w:t>
+              <w:t xml:space="preserve">Workbook Think Harder T2: 9 + 6 = __ + 10</w:t>
             </w:r>
           </w:p>
         </w:tc>
@@ -13930,7 +13930,7 @@
                 <w:sz w:val="20"/>
                 <w:szCs w:val="20"/>
               </w:rPr>
-              <w:t xml:space="preserve">3</w:t>
+              <w:t xml:space="preserve">5</w:t>
             </w:r>
           </w:p>
         </w:tc>
@@ -13968,7 +13968,7 @@
                 <w:sz w:val="20"/>
                 <w:szCs w:val="20"/>
               </w:rPr>
-              <w:t xml:space="preserve">Workbook Think Harder T3: 9 + 6 = __ + 10</w:t>
+              <w:t xml:space="preserve">Workbook Think Harder T3: 6 + 4 = 10, so 16 + 4 = __ and 26 + 4 = __</w:t>
             </w:r>
           </w:p>
         </w:tc>
@@ -14001,7 +14001,7 @@
                 <w:sz w:val="20"/>
                 <w:szCs w:val="20"/>
               </w:rPr>
-              <w:t xml:space="preserve">5</w:t>
+              <w:t xml:space="preserve">20 and 30</w:t>
             </w:r>
           </w:p>
         </w:tc>
@@ -14039,7 +14039,7 @@
                 <w:sz w:val="20"/>
                 <w:szCs w:val="20"/>
               </w:rPr>
-              <w:t xml:space="preserve">Workbook Think Harder T4: 12 + 3 = 10 + __</w:t>
+              <w:t xml:space="preserve">Workbook Think Harder T4: Find all the pairs of numbers from 1 to 11 that make 12. (3 + 9 and 9 + 3 count as the same pair.) How many pairs are there?</w:t>
             </w:r>
           </w:p>
         </w:tc>
@@ -14072,7 +14072,7 @@
                 <w:sz w:val="20"/>
                 <w:szCs w:val="20"/>
               </w:rPr>
-              <w:t xml:space="preserve">5</w:t>
+              <w:t xml:space="preserve">6 pairs: 1 + 11, 2 + 10, 3 + 9, 4 + 8, 5 + 7, 6 + 6. Going down one number at a time shows none are missed.</w:t>
             </w:r>
           </w:p>
         </w:tc>
@@ -14110,7 +14110,7 @@
                 <w:sz w:val="20"/>
                 <w:szCs w:val="20"/>
               </w:rPr>
-              <w:t xml:space="preserve">Workbook Challenge C1: Three different numbers from 1 to 7 add up to 10. Find every set of three.</w:t>
+              <w:t xml:space="preserve">Workbook Challenge C1: Put 1 to 6 in the magic triangle so each side adds to 11. What goes in the corners and middles?</w:t>
             </w:r>
           </w:p>
         </w:tc>
@@ -14143,7 +14143,7 @@
                 <w:sz w:val="20"/>
                 <w:szCs w:val="20"/>
               </w:rPr>
-              <w:t xml:space="preserve">1, 2, 7; 1, 3, 6; 1, 4, 5; 2, 3, 5.</w:t>
+              <w:t xml:space="preserve">Corners 2, 4, 6. Between 2 and 4: 5. Between 4 and 6: 1. Between 6 and 2: 3. (It is the only set of corners that works.)</w:t>
             </w:r>
           </w:p>
         </w:tc>
@@ -14181,7 +14181,7 @@
                 <w:sz w:val="20"/>
                 <w:szCs w:val="20"/>
               </w:rPr>
-              <w:t xml:space="preserve">Workbook Challenge C2: Put 1 to 6 in the magic triangle so each side adds to 11. What goes in the corners and middles?</w:t>
+              <w:t xml:space="preserve">Workbook Challenge C2: Ali has 20 stickers. He keeps 9 and shares the rest between Ben and Mei. Ben gets 3 more than Mei. How many does each get?</w:t>
             </w:r>
           </w:p>
         </w:tc>
@@ -14214,7 +14214,7 @@
                 <w:sz w:val="20"/>
                 <w:szCs w:val="20"/>
               </w:rPr>
-              <w:t xml:space="preserve">Corners 2, 4, 6. Between 2 and 4: 5. Between 4 and 6: 1. Between 6 and 2: 3.</w:t>
+              <w:t xml:space="preserve">Ben 7, Mei 4. (20 − 9 = 11 are shared; take away Ben's extra 3: 8, share 4 and 4; Ben has 4 + 3 = 7.)</w:t>
             </w:r>
           </w:p>
         </w:tc>
@@ -14252,7 +14252,7 @@
                 <w:sz w:val="20"/>
                 <w:szCs w:val="20"/>
               </w:rPr>
-              <w:t xml:space="preserve">Workbook Challenge C3: Ali has 20 stickers. He keeps 9 and shares the rest between Ben and Mei. Ben gets 3 more than Mei. How many does each get?</w:t>
+              <w:t xml:space="preserve">Workbook Challenge C3: Change the magic triangle: use the numbers 2, 3, 4, 5, 6 and 7 instead of 1 to 6. Can you make every side add to the same total? Try it. Which totals can you make?</w:t>
             </w:r>
           </w:p>
         </w:tc>
@@ -14285,7 +14285,7 @@
                 <w:sz w:val="20"/>
                 <w:szCs w:val="20"/>
               </w:rPr>
-              <w:t xml:space="preserve">Ben 7, Mei 4.</w:t>
+              <w:t xml:space="preserve">Open. Yes, it still works. Totals 12, 13, 14 and 15 are possible. Example for 12: corners 2, 3, 4 with 7 between 2 and 3, 5 between 3 and 4 and 6 between 4 and 2.</w:t>
             </w:r>
           </w:p>
         </w:tc>
@@ -17979,7 +17979,7 @@
                 <w:sz w:val="20"/>
                 <w:szCs w:val="20"/>
               </w:rPr>
-              <w:t xml:space="preserve">Workbook Think Harder T3: 1 picture = 2 children. Red has 3 pictures and blue has 5. How many more children chose blue than red?</w:t>
+              <w:t xml:space="preserve">Workbook Think Harder T3: 1 picture = 2 children. Six children chose pizza. How many pictures should we draw?</w:t>
             </w:r>
           </w:p>
         </w:tc>
@@ -18012,7 +18012,7 @@
                 <w:sz w:val="20"/>
                 <w:szCs w:val="20"/>
               </w:rPr>
-              <w:t xml:space="preserve">4 (2 more pictures, each worth 2: 2, 4)</w:t>
+              <w:t xml:space="preserve">3</w:t>
             </w:r>
           </w:p>
         </w:tc>
@@ -18050,7 +18050,7 @@
                 <w:sz w:val="20"/>
                 <w:szCs w:val="20"/>
               </w:rPr>
-              <w:t xml:space="preserve">Workbook Think Harder T4: 1 picture = 2 children. Six children chose pizza. How many pictures should we draw?</w:t>
+              <w:t xml:space="preserve">Workbook Think Harder T4: 1 picture = 2 children. A half picture means 1 child. Apple has 3 pictures and a half. How many children chose apple?</w:t>
             </w:r>
           </w:p>
         </w:tc>
@@ -18083,7 +18083,7 @@
                 <w:sz w:val="20"/>
                 <w:szCs w:val="20"/>
               </w:rPr>
-              <w:t xml:space="preserve">3</w:t>
+              <w:t xml:space="preserve">7</w:t>
             </w:r>
           </w:p>
         </w:tc>
@@ -18121,7 +18121,7 @@
                 <w:sz w:val="20"/>
                 <w:szCs w:val="20"/>
               </w:rPr>
-              <w:t xml:space="preserve">Workbook Challenge C1: 1 picture = 3 children. Apple has 4 pictures, banana 2 and orange 5. Then 7 more children join and all choose banana. Which fruit wins now, and by how many votes?</w:t>
+              <w:t xml:space="preserve">Workbook Challenge C1: 24 children voted. Apple got 6 votes. Orange got 6 more votes than banana. How many votes did banana and orange get?</w:t>
             </w:r>
           </w:p>
         </w:tc>
@@ -18154,7 +18154,7 @@
                 <w:sz w:val="20"/>
                 <w:szCs w:val="20"/>
               </w:rPr>
-              <w:t xml:space="preserve">Orange 15, banana 13, apple 12. Orange wins by 2.</w:t>
+              <w:t xml:space="preserve">Banana 6 and orange 12. (24 − 6 = 18 for banana and orange; take away the extra 6: 12, share: 6 each; give orange the 6 back.)</w:t>
             </w:r>
           </w:p>
         </w:tc>
@@ -18192,7 +18192,7 @@
                 <w:sz w:val="20"/>
                 <w:szCs w:val="20"/>
               </w:rPr>
-              <w:t xml:space="preserve">Workbook Challenge C2: 24 children voted. Apple got 6 votes. Orange got 6 more votes than banana. How many votes did banana and orange get?</w:t>
+              <w:t xml:space="preserve">Workbook Challenge C2: 1 picture = 2 children. 20 children voted for three fruits. A has 3 pictures. B has 2 more pictures than A. How many children chose C?</w:t>
             </w:r>
           </w:p>
         </w:tc>
@@ -18225,7 +18225,7 @@
                 <w:sz w:val="20"/>
                 <w:szCs w:val="20"/>
               </w:rPr>
-              <w:t xml:space="preserve">Banana 6 and orange 12. (24 − 6 = 18 for banana and orange; take away the extra 6: 12, share: 6 each; give orange the 6 back.)</w:t>
+              <w:t xml:space="preserve">4 children (20 ÷ 2 = 10 pictures in all, counting in 2s to 20; A 3 + B 5 = 8, so C has 2 pictures = 4 children).</w:t>
             </w:r>
           </w:p>
         </w:tc>
@@ -18263,7 +18263,7 @@
                 <w:sz w:val="20"/>
                 <w:szCs w:val="20"/>
               </w:rPr>
-              <w:t xml:space="preserve">Workbook Challenge C3: 1 picture = 2 children. 20 children voted for three fruits. A has 3 pictures. B has 2 more pictures than A. How many children chose C?</w:t>
+              <w:t xml:space="preserve">Workbook Challenge C3: Make up your own: 15 children vote for three fruits. Draw a picture graph where banana wins by exactly 2 votes (banana has 2 more than the fruit in second place) and no two fruits are tied. Then try to find a second graph that works.</w:t>
             </w:r>
           </w:p>
         </w:tc>
@@ -18296,7 +18296,7 @@
                 <w:sz w:val="20"/>
                 <w:szCs w:val="20"/>
               </w:rPr>
-              <w:t xml:space="preserve">4 children (20 ÷ 2 = 10 pictures in all, counting in 2s to 20; A 3 + B 5 = 8, so C has 2 pictures = 4 children).</w:t>
+              <w:t xml:space="preserve">Open. Check: total 15, banana is ahead of second place by exactly 2, no ties. There are exactly two graphs: banana 7, apple 5, grape 3; or banana 8, apple 6, grape 1.</w:t>
             </w:r>
           </w:p>
         </w:tc>
@@ -22012,7 +22012,7 @@
                 <w:sz w:val="20"/>
                 <w:szCs w:val="20"/>
               </w:rPr>
-              <w:t xml:space="preserve">Workbook Think Harder T3: Same pattern: in which places do the squares come? Write the first five.</w:t>
+              <w:t xml:space="preserve">Workbook Think Harder T3: Red, blue, blue, red, blue, blue … What colour is the 20th bead?</w:t>
             </w:r>
           </w:p>
         </w:tc>
@@ -22045,7 +22045,7 @@
                 <w:sz w:val="20"/>
                 <w:szCs w:val="20"/>
               </w:rPr>
-              <w:t xml:space="preserve">4, 8, 12, 16, 20</w:t>
+              <w:t xml:space="preserve">blue</w:t>
             </w:r>
           </w:p>
         </w:tc>
@@ -22083,7 +22083,7 @@
                 <w:sz w:val="20"/>
                 <w:szCs w:val="20"/>
               </w:rPr>
-              <w:t xml:space="preserve">Workbook Think Harder T4: Red, blue, blue, red, blue, blue … What colour is the 20th bead?</w:t>
+              <w:t xml:space="preserve">Workbook Think Harder T4: Squares in a row need 4, 7, 10, … sticks. With 20 sticks, how many squares can you make? How many sticks are left over?</w:t>
             </w:r>
           </w:p>
         </w:tc>
@@ -22116,7 +22116,7 @@
                 <w:sz w:val="20"/>
                 <w:szCs w:val="20"/>
               </w:rPr>
-              <w:t xml:space="preserve">blue</w:t>
+              <w:t xml:space="preserve">6 squares and 1 stick left over. The table goes 4, 7, 10, 13, 16, 19; 7 squares would need 22, which is too many; 20 − 19 = 1.</w:t>
             </w:r>
           </w:p>
         </w:tc>
@@ -22154,7 +22154,7 @@
                 <w:sz w:val="20"/>
                 <w:szCs w:val="20"/>
               </w:rPr>
-              <w:t xml:space="preserve">Workbook Challenge C1: Squares in a row use 4, 7, 10 … sticks. Ben has 50 sticks. How many squares can he make? How many sticks are left?</w:t>
+              <w:t xml:space="preserve">Workbook Challenge C1: Beads repeat in a pattern of 5: red, red, blue, blue, green. How many green beads are in the first 47 beads?</w:t>
             </w:r>
           </w:p>
         </w:tc>
@@ -22187,7 +22187,7 @@
                 <w:sz w:val="20"/>
                 <w:szCs w:val="20"/>
               </w:rPr>
-              <w:t xml:space="preserve">16 squares use 49 sticks. 1 stick is left.</w:t>
+              <w:t xml:space="preserve">9 green beads. Green is the 5th bead of each core, so greens are at 5, 10, 15 … 45: count in 5s, that is 9 numbers. Beads 46 and 47 are red.</w:t>
             </w:r>
           </w:p>
         </w:tc>
@@ -22225,7 +22225,7 @@
                 <w:sz w:val="20"/>
                 <w:szCs w:val="20"/>
               </w:rPr>
-              <w:t xml:space="preserve">Workbook Challenge C2: Beads repeat in a pattern of 5: red, red, blue, blue, green. How many green beads are in the first 47 beads?</w:t>
+              <w:t xml:space="preserve">Workbook Challenge C2: Dots: 1, 3, 6, 10, 15 … What are the next two numbers? What is the 10th number?</w:t>
             </w:r>
           </w:p>
         </w:tc>
@@ -22258,7 +22258,7 @@
                 <w:sz w:val="20"/>
                 <w:szCs w:val="20"/>
               </w:rPr>
-              <w:t xml:space="preserve">9 green beads. Green is the 5th bead of each core, so greens are at 5, 10, 15 … 45: count in 5s, that is 9 numbers. Beads 46 and 47 are red.</w:t>
+              <w:t xml:space="preserve">21 and 28. The 10th is 55 (add 2, 3, 4, … each time).</w:t>
             </w:r>
           </w:p>
         </w:tc>
@@ -22296,7 +22296,7 @@
                 <w:sz w:val="20"/>
                 <w:szCs w:val="20"/>
               </w:rPr>
-              <w:t xml:space="preserve">Workbook Challenge C3: Dots: 1, 3, 6, 10, 15 … What are the next two numbers? What is the 10th number?</w:t>
+              <w:t xml:space="preserve">Workbook Challenge C3: Make up your own repeating pattern with a core of 5 beads (use up to 3 colours). Ask a partner: what colour is the 33rd bead? Write the answer and how you know.</w:t>
             </w:r>
           </w:p>
         </w:tc>
@@ -22329,7 +22329,7 @@
                 <w:sz w:val="20"/>
                 <w:szCs w:val="20"/>
               </w:rPr>
-              <w:t xml:space="preserve">21 and 28. The 10th is 55 (add 2, 3, 4, … each time).</w:t>
+              <w:t xml:space="preserve">Open. Check: 30 ends a core of 5 (count in 5s), so the 33rd bead is the 3rd bead of the core. Example: red, red, blue, blue, green gives blue.</w:t>
             </w:r>
           </w:p>
         </w:tc>
@@ -23116,7 +23116,7 @@
           <w:sz w:val="20"/>
           <w:szCs w:val="20"/>
         </w:rPr>
-        <w:t xml:space="preserve">1) circle  2) 6 squares and 1 stick left over  3) 9 Bs</w:t>
+        <w:t xml:space="preserve">1) circle  2) 9 Bs  3) Yes: count in 5s, 25 ends a core, like the 5th</w:t>
       </w:r>
     </w:p>
     <w:p>
@@ -26115,7 +26115,7 @@
                 <w:sz w:val="20"/>
                 <w:szCs w:val="20"/>
               </w:rPr>
-              <w:t xml:space="preserve">Workbook Challenge C1: I think of a number. I add 7, take away 3, add 5, then take away 8. I get 14. What is my number?</w:t>
+              <w:t xml:space="preserve">Workbook Challenge C1: A number machine has two steps: add 3, then add 4. IN 5 gives OUT 12. What goes IN to give OUT 20? Can you make a one-step machine that does the same job?</w:t>
             </w:r>
           </w:p>
         </w:tc>
@@ -26148,7 +26148,7 @@
                 <w:sz w:val="20"/>
                 <w:szCs w:val="20"/>
               </w:rPr>
-              <w:t xml:space="preserve">13 (the steps are +1 in total, so 14 − 1).</w:t>
+              <w:t xml:space="preserve">13 (20 − 4 = 16, 16 − 3 = 13; check 13 + 3 + 4 = 20). A one-step machine that adds 7 does the same job.</w:t>
             </w:r>
           </w:p>
         </w:tc>
@@ -26186,7 +26186,7 @@
                 <w:sz w:val="20"/>
                 <w:szCs w:val="20"/>
               </w:rPr>
-              <w:t xml:space="preserve">Workbook Challenge C2: Ali and Ben have 20 marbles together. Ali has 4 more than Ben. How many marbles does each have?</w:t>
+              <w:t xml:space="preserve">Workbook Challenge C2: A snail climbs 3 cm each day and slides back 1 cm each night. It starts at the bottom of a 9 cm wall. On which day does it reach the top?</w:t>
             </w:r>
           </w:p>
         </w:tc>
@@ -26219,7 +26219,7 @@
                 <w:sz w:val="20"/>
                 <w:szCs w:val="20"/>
               </w:rPr>
-              <w:t xml:space="preserve">Ben 8 and Ali 12. (Take away the extra 4: 16 left, share: 8 and 8, give Ali the 4 back: 12.)</w:t>
+              <w:t xml:space="preserve">Day 4 (3, 5, 7, then 9 on the fourth day before it can slide back).</w:t>
             </w:r>
           </w:p>
         </w:tc>
@@ -26257,7 +26257,7 @@
                 <w:sz w:val="20"/>
                 <w:szCs w:val="20"/>
               </w:rPr>
-              <w:t xml:space="preserve">Workbook Challenge C3: A snail climbs 3 cm each day and slides back 1 cm each night. It starts at the bottom of a 9 cm wall. On which day does it reach the top?</w:t>
+              <w:t xml:space="preserve">Workbook Challenge C3: Make up a mystery number story with THREE steps whose answer is 10. Write the story. Show how a partner can work backwards to find 10, and how they can check by going forwards.</w:t>
             </w:r>
           </w:p>
         </w:tc>
@@ -26290,7 +26290,7 @@
                 <w:sz w:val="20"/>
                 <w:szCs w:val="20"/>
               </w:rPr>
-              <w:t xml:space="preserve">Day 4 (3, 5, 7, then 9 on the fourth day before it can slide back).</w:t>
+              <w:t xml:space="preserve">Open. Check that the story gives 10 when done forwards and that the partner undoes the steps in the reverse order. Example: I think of a number, add 5, take away 3, add 4, and I get 16 (10 + 5 = 15, 15 − 3 = 12, 12 + 4 = 16).</w:t>
             </w:r>
           </w:p>
         </w:tc>
@@ -27052,7 +27052,7 @@
           <w:sz w:val="20"/>
           <w:szCs w:val="20"/>
         </w:rPr>
-        <w:t xml:space="preserve">(a) 13 children (20 − 7)  (b) 15 children (8 + 8 − 1, Ali is counted twice)</w:t>
+        <w:t xml:space="preserve">(a) 13 children (20 − 7)  (b) 5 children (3 + 3 − 1, Ali is counted twice). Talk time: 8th from both ends is 15.</w:t>
       </w:r>
     </w:p>
     <w:p>
@@ -27102,7 +27102,7 @@
           <w:sz w:val="20"/>
           <w:szCs w:val="20"/>
         </w:rPr>
-        <w:t xml:space="preserve">1) Ben 8, Ali 12  2) 15  3) 10</w:t>
+        <w:t xml:space="preserve">1) 10 children  2) 7 sweets  3) 11</w:t>
       </w:r>
     </w:p>
     <w:p>
@@ -29279,7 +29279,7 @@
           <w:sz w:val="21"/>
           <w:szCs w:val="21"/>
         </w:rPr>
-        <w:t xml:space="preserve">Stopping at the first set in Think Harder T2 instead of checking for all of them.</w:t>
+        <w:t xml:space="preserve">Stopping at the first set in Think Harder T1 instead of checking for all of them.</w:t>
       </w:r>
     </w:p>
     <w:p>
@@ -29817,7 +29817,7 @@
                 <w:sz w:val="20"/>
                 <w:szCs w:val="20"/>
               </w:rPr>
-              <w:t xml:space="preserve">Workbook Think Harder T1: A bag costs $34. Ali pays with a $50 note. How much change does he get?</w:t>
+              <w:t xml:space="preserve">Workbook Think Harder T1: Make 70¢ using exactly 4 coins from 5¢, 10¢, 20¢ and 50¢. Find every set.</w:t>
             </w:r>
           </w:p>
         </w:tc>
@@ -29850,7 +29850,7 @@
                 <w:sz w:val="20"/>
                 <w:szCs w:val="20"/>
               </w:rPr>
-              <w:t xml:space="preserve">$16. Count on from $34: $36, $40, $50. That is $2 + $4 + $10 = $16.</w:t>
+              <w:t xml:space="preserve">2 sets: 50¢ + 10¢ + 5¢ + 5¢, and 20¢ + 20¢ + 20¢ + 10¢.</w:t>
             </w:r>
           </w:p>
         </w:tc>
@@ -29888,7 +29888,7 @@
                 <w:sz w:val="20"/>
                 <w:szCs w:val="20"/>
               </w:rPr>
-              <w:t xml:space="preserve">Workbook Think Harder T2: Make 70¢ using exactly 4 coins from 5¢, 10¢, 20¢ and 50¢. Find every set.</w:t>
+              <w:t xml:space="preserve">Workbook Think Harder T2: Sam has only 10¢ and 20¢ coins. He pays exactly 90¢ using 6 coins. How many of each coin does he use?</w:t>
             </w:r>
           </w:p>
         </w:tc>
@@ -29921,7 +29921,7 @@
                 <w:sz w:val="20"/>
                 <w:szCs w:val="20"/>
               </w:rPr>
-              <w:t xml:space="preserve">2 sets: 50¢ + 10¢ + 5¢ + 5¢, and 20¢ + 20¢ + 20¢ + 10¢.</w:t>
+              <w:t xml:space="preserve">Three 10¢ and three 20¢ (30 + 60 = 90).</w:t>
             </w:r>
           </w:p>
         </w:tc>
@@ -29959,7 +29959,7 @@
                 <w:sz w:val="20"/>
                 <w:szCs w:val="20"/>
               </w:rPr>
-              <w:t xml:space="preserve">Workbook Think Harder T3: Sam has only 10¢ and 20¢ coins. He pays exactly 90¢ using 6 coins. How many of each coin does he use?</w:t>
+              <w:t xml:space="preserve">Workbook Think Harder T3: What is the fewest number of coins to make 45¢?</w:t>
             </w:r>
           </w:p>
         </w:tc>
@@ -29992,7 +29992,7 @@
                 <w:sz w:val="20"/>
                 <w:szCs w:val="20"/>
               </w:rPr>
-              <w:t xml:space="preserve">Three 10¢ and three 20¢ (30 + 60 = 90).</w:t>
+              <w:t xml:space="preserve">3 coins (20¢ + 20¢ + 5¢)</w:t>
             </w:r>
           </w:p>
         </w:tc>
@@ -30030,7 +30030,7 @@
                 <w:sz w:val="20"/>
                 <w:szCs w:val="20"/>
               </w:rPr>
-              <w:t xml:space="preserve">Workbook Think Harder T4: What is the fewest number of coins to make 45¢?</w:t>
+              <w:t xml:space="preserve">Workbook Think Harder T4: How many ways can you make 25¢ using 20¢, 10¢ and 5¢ coins?</w:t>
             </w:r>
           </w:p>
         </w:tc>
@@ -30063,7 +30063,7 @@
                 <w:sz w:val="20"/>
                 <w:szCs w:val="20"/>
               </w:rPr>
-              <w:t xml:space="preserve">3 coins (20¢ + 20¢ + 5¢)</w:t>
+              <w:t xml:space="preserve">4 ways. (20+5; 10+10+5; 10+5+5+5; 5+5+5+5+5)</w:t>
             </w:r>
           </w:p>
         </w:tc>
@@ -30101,7 +30101,7 @@
                 <w:sz w:val="20"/>
                 <w:szCs w:val="20"/>
               </w:rPr>
-              <w:t xml:space="preserve">Workbook Challenge C1: Ali pays 55¢ with exactly 5 coins. He uses at least one 5¢, one 10¢ and one 20¢ coin. Which coins does he use?</w:t>
+              <w:t xml:space="preserve">Workbook Challenge C1: You have one 5¢, one 10¢, one 20¢ and one 50¢ coin. How many different amounts can you make using any of them? What if you also had a $1 coin (100¢)?</w:t>
             </w:r>
           </w:p>
         </w:tc>
@@ -30134,7 +30134,7 @@
                 <w:sz w:val="20"/>
                 <w:szCs w:val="20"/>
               </w:rPr>
-              <w:t xml:space="preserve">20¢ + 10¢ + 10¢ + 10¢ + 5¢ (the only way).</w:t>
+              <w:t xml:space="preserve">15 different amounts: with 3 coins there are 7, and the 50¢ coin doubles that and adds one more. With a $1 coin as well there are 31: each new coin doubles the amounts and adds one more.</w:t>
             </w:r>
           </w:p>
         </w:tc>
@@ -30172,7 +30172,7 @@
                 <w:sz w:val="20"/>
                 <w:szCs w:val="20"/>
               </w:rPr>
-              <w:t xml:space="preserve">Workbook Challenge C2: You have one 5¢, one 10¢, one 20¢ and one 50¢ coin. How many different amounts can you make using any of them?</w:t>
+              <w:t xml:space="preserve">Workbook Challenge C2: A sweet costs 15¢ and a biscuit costs 20¢. Ben spends exactly 90¢ and buys some of each. How many sweets and biscuits does he buy?</w:t>
             </w:r>
           </w:p>
         </w:tc>
@@ -30205,7 +30205,7 @@
                 <w:sz w:val="20"/>
                 <w:szCs w:val="20"/>
               </w:rPr>
-              <w:t xml:space="preserve">15 different amounts.</w:t>
+              <w:t xml:space="preserve">2 sweets and 3 biscuits.</w:t>
             </w:r>
           </w:p>
         </w:tc>
@@ -30243,7 +30243,7 @@
                 <w:sz w:val="20"/>
                 <w:szCs w:val="20"/>
               </w:rPr>
-              <w:t xml:space="preserve">Workbook Challenge C3: A sweet costs 15¢ and a biscuit costs 20¢. Ben spends exactly 90¢ and buys some of each. How many sweets and biscuits does he buy?</w:t>
+              <w:t xml:space="preserve">Workbook Challenge C3: Make up your own coin puzzle that has exactly ONE answer (for example: "exactly 3 coins that make 35¢"). Write it, swap with a partner and check their answer by listing every possibility.</w:t>
             </w:r>
           </w:p>
         </w:tc>
@@ -30276,7 +30276,7 @@
                 <w:sz w:val="20"/>
                 <w:szCs w:val="20"/>
               </w:rPr>
-              <w:t xml:space="preserve">2 sweets and 3 biscuits.</w:t>
+              <w:t xml:space="preserve">Open. A good puzzle has exactly one way. Example: 35¢ with exactly 3 coins from 5¢, 10¢, 20¢ and 50¢ has only 20¢ + 10¢ + 5¢. Check by listing every set of 3 coins.</w:t>
             </w:r>
           </w:p>
         </w:tc>
@@ -31080,7 +31080,7 @@
           <w:sz w:val="20"/>
           <w:szCs w:val="20"/>
         </w:rPr>
-        <w:t xml:space="preserve">Think Harder T2, T3  </w:t>
+        <w:t xml:space="preserve">Think Harder T1 to T4  </w:t>
       </w:r>
       <w:r>
         <w:rPr>
@@ -31088,7 +31088,7 @@
           <w:sz w:val="20"/>
           <w:szCs w:val="20"/>
         </w:rPr>
-        <w:t xml:space="preserve">T2: two sets, 50¢ + 10¢ + 5¢ + 5¢, and 20¢ + 20¢ + 20¢ + 10¢.  T3: three 10¢ and three 20¢ (30 + 60 = 90); four coins of 20¢ make only 80¢, so 4 coins cannot make 90¢.</w:t>
+        <w:t xml:space="preserve">T1: two sets, 50¢ + 10¢ + 5¢ + 5¢, and 20¢ + 20¢ + 20¢ + 10¢.  T2: three 10¢ and three 20¢ (30 + 60 = 90); four coins of 20¢ make only 80¢, so 4 coins cannot make 90¢.  T3: 3 coins (20¢ + 20¢ + 5¢); no two coins make 45¢.  T4: 4 ways (20+5; 10+10+5; 10+5+5+5; five 5¢).</w:t>
       </w:r>
     </w:p>
     <w:p>
@@ -31113,7 +31113,7 @@
           <w:sz w:val="20"/>
           <w:szCs w:val="20"/>
         </w:rPr>
-        <w:t xml:space="preserve">1) 9 ways  2) Three 10¢ and three 5¢  3) 4 coins (50¢ + 20¢ + 20¢ + 5¢)</w:t>
+        <w:t xml:space="preserve">1) 9 ways  2) $10 + $1 + $1 and $5 + $5 + $2  3) 4 coins (50¢ + 20¢ + 20¢ + 5¢)</w:t>
       </w:r>
     </w:p>
     <w:p>
@@ -33216,7 +33216,7 @@
           <w:sz w:val="21"/>
           <w:szCs w:val="21"/>
         </w:rPr>
-        <w:t xml:space="preserve">Counting only the small triangles in Q4 picture C (4 instead of 8): look for bigger triangles made of 2 small ones.</w:t>
+        <w:t xml:space="preserve">Counting only the small triangles in the talk-time picture (4 instead of 8): look for bigger triangles made of 2 small ones.</w:t>
       </w:r>
     </w:p>
     <w:p>
@@ -33846,7 +33846,7 @@
                 <w:sz w:val="20"/>
                 <w:szCs w:val="20"/>
               </w:rPr>
-              <w:t xml:space="preserve">Workbook Think Harder T1: Fold a square along a diagonal and cut. Which shapes do you get?</w:t>
+              <w:t xml:space="preserve">Workbook Think Harder T1: Two same-size triangles can make a square. Can they also make a bigger triangle? Draw how.</w:t>
             </w:r>
           </w:p>
         </w:tc>
@@ -33879,7 +33879,7 @@
                 <w:sz w:val="20"/>
                 <w:szCs w:val="20"/>
               </w:rPr>
-              <w:t xml:space="preserve">2 triangles of the same size</w:t>
+              <w:t xml:space="preserve">Yes. Join them along a short side (the two equal short sides touching) to make one bigger triangle. Joining along the long side makes a square instead.</w:t>
             </w:r>
           </w:p>
         </w:tc>
@@ -33917,7 +33917,7 @@
                 <w:sz w:val="20"/>
                 <w:szCs w:val="20"/>
               </w:rPr>
-              <w:t xml:space="preserve">Workbook Think Harder T2: Two same-size triangles can make a square. Can they also make a bigger triangle? Draw how.</w:t>
+              <w:t xml:space="preserve">Workbook Think Harder T2: How many squares are in a grid 3 squares long and 2 squares high?</w:t>
             </w:r>
           </w:p>
         </w:tc>
@@ -33950,7 +33950,7 @@
                 <w:sz w:val="20"/>
                 <w:szCs w:val="20"/>
               </w:rPr>
-              <w:t xml:space="preserve">Yes. Join them along a short side (the two equal short sides touching) to make one bigger triangle. Joining along the long side makes a square instead.</w:t>
+              <w:t xml:space="preserve">8 (6 small squares + 2 squares made of 4 small ones)</w:t>
             </w:r>
           </w:p>
         </w:tc>
@@ -33988,7 +33988,7 @@
                 <w:sz w:val="20"/>
                 <w:szCs w:val="20"/>
               </w:rPr>
-              <w:t xml:space="preserve">Workbook Think Harder T3: How many squares are in a grid 3 squares long and 2 squares high?</w:t>
+              <w:t xml:space="preserve">Workbook Think Harder T3: A square has both diagonals drawn (lines joining opposite corners). How many triangles can you find? Count the small ones first.</w:t>
             </w:r>
           </w:p>
         </w:tc>
@@ -34021,7 +34021,7 @@
                 <w:sz w:val="20"/>
                 <w:szCs w:val="20"/>
               </w:rPr>
-              <w:t xml:space="preserve">8 (6 small squares + 2 squares made of 4 small ones)</w:t>
+              <w:t xml:space="preserve">8 (4 small + 4 made of two small ones)</w:t>
             </w:r>
           </w:p>
         </w:tc>
@@ -34059,7 +34059,7 @@
                 <w:sz w:val="20"/>
                 <w:szCs w:val="20"/>
               </w:rPr>
-              <w:t xml:space="preserve">Workbook Think Harder T4: Join 4 same-size squares, whole sides touching. How many different shapes can you make? (Turns and flips are the same shape.)</w:t>
+              <w:t xml:space="preserve">Workbook Think Harder T4: Draw a shape with 4 straight sides that is NOT a square. Is it a rectangle? How do you know?</w:t>
             </w:r>
           </w:p>
         </w:tc>
@@ -34092,7 +34092,7 @@
                 <w:sz w:val="20"/>
                 <w:szCs w:val="20"/>
               </w:rPr>
-              <w:t xml:space="preserve">5 shapes: a line of 4, a 2 by 2 square, an L, a T and a zigzag.</w:t>
+              <w:t xml:space="preserve">Open. A long rectangle has 4 square corners, so it is a rectangle. A slanted shape with 4 sides does not have square corners, so it is not a rectangle.</w:t>
             </w:r>
           </w:p>
         </w:tc>
@@ -34130,7 +34130,7 @@
                 <w:sz w:val="20"/>
                 <w:szCs w:val="20"/>
               </w:rPr>
-              <w:t xml:space="preserve">Workbook Challenge C1: Three squares are joined in a row to make a long rectangle. How many rectangles can you find altogether? (A square counts as a rectangle.)</w:t>
+              <w:t xml:space="preserve">Workbook Challenge C1: A triangle has 4 lines drawn from the top corner to the bottom. How many triangles are there? Follow the pattern 3, 6, 10 … What would 5 lines give?</w:t>
             </w:r>
           </w:p>
         </w:tc>
@@ -34163,7 +34163,7 @@
                 <w:sz w:val="20"/>
                 <w:szCs w:val="20"/>
               </w:rPr>
-              <w:t xml:space="preserve">6 (3 single squares, 2 pairs and 1 whole row).</w:t>
+              <w:t xml:space="preserve">15 triangles with 4 lines, and 21 with 5 lines (add 2, 3, 4, 5, 6 each time).</w:t>
             </w:r>
           </w:p>
         </w:tc>
@@ -34201,7 +34201,7 @@
                 <w:sz w:val="20"/>
                 <w:szCs w:val="20"/>
               </w:rPr>
-              <w:t xml:space="preserve">Workbook Challenge C2: A triangle has 4 lines drawn from the top corner to the bottom. How many triangles are there? Follow the pattern 3, 6, 10 …</w:t>
+              <w:t xml:space="preserve">Workbook Challenge C2: A square is cut into 4 equal squares. One of the small squares is cut into 4 even smaller squares. How many squares can you find altogether?</w:t>
             </w:r>
           </w:p>
         </w:tc>
@@ -34234,7 +34234,7 @@
                 <w:sz w:val="20"/>
                 <w:szCs w:val="20"/>
               </w:rPr>
-              <w:t xml:space="preserve">15.</w:t>
+              <w:t xml:space="preserve">9 (1 big, 4 medium, 4 tiny).</w:t>
             </w:r>
           </w:p>
         </w:tc>
@@ -34272,7 +34272,7 @@
                 <w:sz w:val="20"/>
                 <w:szCs w:val="20"/>
               </w:rPr>
-              <w:t xml:space="preserve">Workbook Challenge C3: A square is cut into 4 equal squares. One of the small squares is cut into 4 even smaller squares. How many squares can you find altogether?</w:t>
+              <w:t xml:space="preserve">Workbook Challenge C3: Draw your own triangle-counting puzzle: a big triangle with some lines inside. Count the triangles. Swap with a partner. Do you both get the same number? If not, find out who missed some.</w:t>
             </w:r>
           </w:p>
         </w:tc>
@@ -34305,7 +34305,7 @@
                 <w:sz w:val="20"/>
                 <w:szCs w:val="20"/>
               </w:rPr>
-              <w:t xml:space="preserve">9 (1 big, 4 medium, 4 tiny).</w:t>
+              <w:t xml:space="preserve">Open. Check by counting small triangles first, then bigger ones made of 2, 3 … small ones. Example: one line from the top corner to the bottom gives 3 triangles; two lines give 6.</w:t>
             </w:r>
           </w:p>
         </w:tc>
@@ -35067,7 +35067,7 @@
           <w:sz w:val="20"/>
           <w:szCs w:val="20"/>
         </w:rPr>
-        <w:t xml:space="preserve">A: 3  B: 2  C: 8 (4 small + 4 made of two small ones)</w:t>
+        <w:t xml:space="preserve">A: 3  B: 2. (The square with both diagonals, 8 triangles, is the talk-time question: 4 small + 4 made of two small ones.)</w:t>
       </w:r>
     </w:p>
     <w:p>
@@ -35142,7 +35142,7 @@
           <w:sz w:val="20"/>
           <w:szCs w:val="20"/>
         </w:rPr>
-        <w:t xml:space="preserve">1) 8  2) 9  3) 5 shapes</w:t>
+        <w:t xml:space="preserve">1) 6  2) 9  3) Yes to both: the square again, and one big triangle with a long side twice as long</w:t>
       </w:r>
     </w:p>
     <w:p>
@@ -38070,7 +38070,7 @@
                 <w:sz w:val="20"/>
                 <w:szCs w:val="20"/>
               </w:rPr>
-              <w:t xml:space="preserve">Workbook Challenge C1: Five friends run a race. D is first. E is last. B finishes directly behind A. C is not second. In what order do they finish?</w:t>
+              <w:t xml:space="preserve">Workbook Challenge C1: A secret number is between 10 and 30. It is even, and you say it when counting in 3s. It is 2 more than a number you say when counting in 5s. What is it?</w:t>
             </w:r>
           </w:p>
         </w:tc>
@@ -38103,7 +38103,7 @@
                 <w:sz w:val="20"/>
                 <w:szCs w:val="20"/>
               </w:rPr>
-              <w:t xml:space="preserve">D, A, B, C, E.</w:t>
+              <w:t xml:space="preserve">12.</w:t>
             </w:r>
           </w:p>
         </w:tc>
@@ -38141,7 +38141,7 @@
                 <w:sz w:val="20"/>
                 <w:szCs w:val="20"/>
               </w:rPr>
-              <w:t xml:space="preserve">Workbook Challenge C2: A secret number is between 10 and 30. It is even, and you say it when counting in 3s. It is 2 more than a number you say when counting in 5s. What is it?</w:t>
+              <w:t xml:space="preserve">Workbook Challenge C2: Numbers 1 to 20. Sort them in a two-loop picture with the loops "I say it counting in 2s" and "I say it counting in 3s". How many numbers go in each part? Then use the loops "counting in 2s" and "counting in 4s". What is different, and why?</w:t>
             </w:r>
           </w:p>
         </w:tc>
@@ -38174,7 +38174,7 @@
                 <w:sz w:val="20"/>
                 <w:szCs w:val="20"/>
               </w:rPr>
-              <w:t xml:space="preserve">12.</w:t>
+              <w:t xml:space="preserve">2s and 3s: 2s only 7, 3s only 3, both 3 (6, 12, 18), neither 7. 2s and 4s: 2s only 5, 4s only 0, both 5 (4, 8, 12, 16, 20), neither 10. Every number we say counting in 4s we also say counting in 2s, so the 4s loop sits completely inside the 2s loop.</w:t>
             </w:r>
           </w:p>
         </w:tc>
@@ -38212,7 +38212,7 @@
                 <w:sz w:val="20"/>
                 <w:szCs w:val="20"/>
               </w:rPr>
-              <w:t xml:space="preserve">Workbook Challenge C3: Numbers 1 to 20. How many do we say only when counting in 2s, only in 3s, in both, and in neither?</w:t>
+              <w:t xml:space="preserve">Workbook Challenge C3: Make up your own "Who has which pet?" puzzle with three friends and three pets. Write clues so that there is only ONE answer. Swap with a partner and check that they find your answer.</w:t>
             </w:r>
           </w:p>
         </w:tc>
@@ -38245,7 +38245,7 @@
                 <w:sz w:val="20"/>
                 <w:szCs w:val="20"/>
               </w:rPr>
-              <w:t xml:space="preserve">2 only: 7. 3 only: 3. Both: 3 (6, 12, 18). Neither: 7.</w:t>
+              <w:t xml:space="preserve">Open. Check by trying all 6 ways to hand out the pets. Example: Ana, Bo and Cy have a cat, a dog and a fish. Ana does not have the cat. Bo does not have the dog or the fish. Cy does not have the fish. Answer: Ana fish, Bo cat, Cy dog.</w:t>
             </w:r>
           </w:p>
         </w:tc>
@@ -41721,7 +41721,7 @@
                 <w:sz w:val="20"/>
                 <w:szCs w:val="20"/>
               </w:rPr>
-              <w:t xml:space="preserve">Workbook Think Harder T1: A caterpillar is 9 cubes long. It grows 2 cubes each day. How long is it after 3 days?</w:t>
+              <w:t xml:space="preserve">Workbook Think Harder T1: A ribbon lies from the 3 cm mark to the 11 cm mark on a ruler. How long is it?</w:t>
             </w:r>
           </w:p>
         </w:tc>
@@ -41754,7 +41754,7 @@
                 <w:sz w:val="20"/>
                 <w:szCs w:val="20"/>
               </w:rPr>
-              <w:t xml:space="preserve">15 cubes</w:t>
+              <w:t xml:space="preserve">8 cm (count the spaces from 3 to 11, or 11 − 3)</w:t>
             </w:r>
           </w:p>
         </w:tc>
@@ -41792,7 +41792,7 @@
                 <w:sz w:val="20"/>
                 <w:szCs w:val="20"/>
               </w:rPr>
-              <w:t xml:space="preserve">Workbook Think Harder T2: A string is 15 cubes long. A rope is 8 cubes longer. How long is the rope?</w:t>
+              <w:t xml:space="preserve">Workbook Think Harder T2: A red ribbon lies from the 2 cm mark to the 9 cm mark. A blue ribbon lies from the 5 cm mark to the 11 cm mark. Which ribbon is longer? By how many cm?</w:t>
             </w:r>
           </w:p>
         </w:tc>
@@ -41825,7 +41825,7 @@
                 <w:sz w:val="20"/>
                 <w:szCs w:val="20"/>
               </w:rPr>
-              <w:t xml:space="preserve">23 cubes</w:t>
+              <w:t xml:space="preserve">Red is longer: red 7 cm, blue 6 cm, so red is 1 cm longer.</w:t>
             </w:r>
           </w:p>
         </w:tc>
@@ -41863,7 +41863,7 @@
                 <w:sz w:val="20"/>
                 <w:szCs w:val="20"/>
               </w:rPr>
-              <w:t xml:space="preserve">Workbook Think Harder T3: A ribbon lies from the 3 cm mark to the 11 cm mark. How long is it?</w:t>
+              <w:t xml:space="preserve">Workbook Think Harder T3: 1 clip is as long as 3 cubes. A pen is 12 cubes long. How many clips long is the pen? A ruler is 5 clips long. How many cubes long is the ruler?</w:t>
             </w:r>
           </w:p>
         </w:tc>
@@ -41896,7 +41896,7 @@
                 <w:sz w:val="20"/>
                 <w:szCs w:val="20"/>
               </w:rPr>
-              <w:t xml:space="preserve">8 cm (count the spaces from 3 to 11, or 11 − 3)</w:t>
+              <w:t xml:space="preserve">4 clips. 15 cubes.</w:t>
             </w:r>
           </w:p>
         </w:tc>
@@ -42005,7 +42005,7 @@
                 <w:sz w:val="20"/>
                 <w:szCs w:val="20"/>
               </w:rPr>
-              <w:t xml:space="preserve">Workbook Challenge C1: A stick is 12 cubes long. Ali measures a desk by laying the stick end to end 4 times and then 5 more cubes. How long is the desk in cubes?</w:t>
+              <w:t xml:space="preserve">Workbook Challenge C1: A train has 3 carriages. Each is 6 cubes long. There is a gap of 1 cube between carriages. How long is the whole train? What if there are 5 carriages?</w:t>
             </w:r>
           </w:p>
         </w:tc>
@@ -42038,7 +42038,7 @@
                 <w:sz w:val="20"/>
                 <w:szCs w:val="20"/>
               </w:rPr>
-              <w:t xml:space="preserve">53 cubes.</w:t>
+              <w:t xml:space="preserve">20 cubes (18 + 2 gaps). With 5 carriages: 30 + 4 gaps = 34 cubes. There is always 1 gap fewer than carriages.</w:t>
             </w:r>
           </w:p>
         </w:tc>
@@ -42076,7 +42076,7 @@
                 <w:sz w:val="20"/>
                 <w:szCs w:val="20"/>
               </w:rPr>
-              <w:t xml:space="preserve">Workbook Challenge C2: Ali’s pencil is 9 cubes. Mei’s is 2 cubes shorter than Ali’s. Ben’s is 3 cubes longer than Mei’s. How long are all three pencils together?</w:t>
+              <w:t xml:space="preserve">Workbook Challenge C2: A ribbon 30 cubes long is cut into three pieces. The first is 4 cubes longer than the second. The third is 4 cubes shorter than the second. How long is each piece?</w:t>
             </w:r>
           </w:p>
         </w:tc>
@@ -42109,7 +42109,7 @@
                 <w:sz w:val="20"/>
                 <w:szCs w:val="20"/>
               </w:rPr>
-              <w:t xml:space="preserve">9 + 7 + 10 = 26 cubes.</w:t>
+              <w:t xml:space="preserve">14, 10 and 6 cubes.</w:t>
             </w:r>
           </w:p>
         </w:tc>
@@ -42147,7 +42147,7 @@
                 <w:sz w:val="20"/>
                 <w:szCs w:val="20"/>
               </w:rPr>
-              <w:t xml:space="preserve">Workbook Challenge C3: A ribbon 30 cubes long is cut into three pieces. The first is 4 cubes longer than the second. The third is 4 cubes shorter than the second. How long is each piece?</w:t>
+              <w:t xml:space="preserve">Workbook Challenge C3: Make up your own measuring puzzle that uses TWO different units (for example clips and cubes). Write the puzzle and its answer. Give it to a partner and check their answer.</w:t>
             </w:r>
           </w:p>
         </w:tc>
@@ -42180,7 +42180,7 @@
                 <w:sz w:val="20"/>
                 <w:szCs w:val="20"/>
               </w:rPr>
-              <w:t xml:space="preserve">14, 10 and 6 cubes.</w:t>
+              <w:t xml:space="preserve">Open. Check that the link between the units is stated and the answer works. Example: 1 clip is as long as 4 cubes. A snake is 5 clips long. How many cubes long is it? Answer: 20 cubes.</w:t>
             </w:r>
           </w:p>
         </w:tc>
@@ -43017,7 +43017,7 @@
           <w:sz w:val="20"/>
           <w:szCs w:val="20"/>
         </w:rPr>
-        <w:t xml:space="preserve">1) 8 cm  2) 24 erasers  3) 5 cubes each and 2 cuts</w:t>
+        <w:t xml:space="preserve">1) 5 cubes each and 2 cuts  2) Ben: six clips of 2 cubes is 12 cubes  3) The 11 cm mark</w:t>
       </w:r>
     </w:p>
     <w:p>
@@ -46198,7 +46198,7 @@
                 <w:sz w:val="20"/>
                 <w:szCs w:val="20"/>
               </w:rPr>
-              <w:t xml:space="preserve">Workbook Think Harder T1: A pattern starts at 5 and adds 3 each time. What is the 10th number?</w:t>
+              <w:t xml:space="preserve">Workbook Think Harder T1: A pattern starts at 4 and adds 6 each time. What is the 8th number? Is 50 in the pattern?</w:t>
             </w:r>
           </w:p>
         </w:tc>
@@ -46231,7 +46231,7 @@
                 <w:sz w:val="20"/>
                 <w:szCs w:val="20"/>
               </w:rPr>
-              <w:t xml:space="preserve">32</w:t>
+              <w:t xml:space="preserve">46 (4, 10, 16, 22, 28, 34, 40, 46). No: the pattern goes 46, 52, so it skips 50.</w:t>
             </w:r>
           </w:p>
         </w:tc>
@@ -46269,7 +46269,7 @@
                 <w:sz w:val="20"/>
                 <w:szCs w:val="20"/>
               </w:rPr>
-              <w:t xml:space="preserve">Workbook Think Harder T2: Ali has 12 stickers. He gives 5 to Mei and then gets 3 more. How many does he have now?</w:t>
+              <w:t xml:space="preserve">Workbook Think Harder T2: Mei thinks of a number, adds 7, takes away 2 and gets 19. Ben does the same and gets 25. How much bigger is Ben's number?</w:t>
             </w:r>
           </w:p>
         </w:tc>
@@ -46302,7 +46302,7 @@
                 <w:sz w:val="20"/>
                 <w:szCs w:val="20"/>
               </w:rPr>
-              <w:t xml:space="preserve">10</w:t>
+              <w:t xml:space="preserve">6 bigger. Work backwards: Mei 19 + 2 = 21, 21 − 7 = 14; Ben 25 + 2 = 27, 27 − 7 = 20; 20 − 14 = 6. (Shortcut: both did the same steps, so the answers differ by the same amount: 25 − 19 = 6.)</w:t>
             </w:r>
           </w:p>
         </w:tc>
@@ -46340,7 +46340,7 @@
                 <w:sz w:val="20"/>
                 <w:szCs w:val="20"/>
               </w:rPr>
-              <w:t xml:space="preserve">Workbook Think Harder T3: Which three coins from 5¢, 10¢, 20¢ and 50¢ make 45¢?</w:t>
+              <w:t xml:space="preserve">Workbook Think Harder T3: Ali has 5 coins worth 60¢. He has only 5¢, 10¢ and 20¢ coins. Find every possible set.</w:t>
             </w:r>
           </w:p>
         </w:tc>
@@ -46373,7 +46373,7 @@
                 <w:sz w:val="20"/>
                 <w:szCs w:val="20"/>
               </w:rPr>
-              <w:t xml:space="preserve">20¢ + 20¢ + 5¢</w:t>
+              <w:t xml:space="preserve">Two sets: 20 + 10 + 10 + 10 + 10, and 20 + 20 + 10 + 5 + 5. Make a table by number of 20¢ coins: one 20¢ needs 40¢ from 4 coins (four 10¢); two 20¢ need 20¢ from 3 coins (10 + 5 + 5); three 20¢ need 0¢ from 2 coins (impossible); no 20¢: 5 coins make at most 50¢.</w:t>
             </w:r>
           </w:p>
         </w:tc>
@@ -46411,7 +46411,7 @@
                 <w:sz w:val="20"/>
                 <w:szCs w:val="20"/>
               </w:rPr>
-              <w:t xml:space="preserve">Workbook Think Harder T4: A ribbon is 12 cubes. A string is 5 cubes shorter. How long is the string?</w:t>
+              <w:t xml:space="preserve">Workbook Think Harder T4: Votes: Apple 6, Banana 9, Orange 7. Then 5 more children vote and all choose apple. Which fruit wins now? By how many votes?</w:t>
             </w:r>
           </w:p>
         </w:tc>
@@ -46444,7 +46444,7 @@
                 <w:sz w:val="20"/>
                 <w:szCs w:val="20"/>
               </w:rPr>
-              <w:t xml:space="preserve">7 cubes</w:t>
+              <w:t xml:space="preserve">Apple wins with 11, which is 2 more than banana (9).</w:t>
             </w:r>
           </w:p>
         </w:tc>
@@ -46482,7 +46482,7 @@
                 <w:sz w:val="20"/>
                 <w:szCs w:val="20"/>
               </w:rPr>
-              <w:t xml:space="preserve">Workbook Challenge C1: Frog A jumps in 3s from 0 and frog B jumps in 5s from 0. Which numbers up to 60 do both land on?</w:t>
+              <w:t xml:space="preserve">Workbook Challenge C1: Triangles in a row use 3, 5, 7 … sticks. Squares in a row use 4, 7, 10 … sticks. Which numbers of sticks, up to 31, can make a row of triangles AND (with the same number of sticks) a row of squares, with none left over? What do you notice?</w:t>
             </w:r>
           </w:p>
         </w:tc>
@@ -46515,7 +46515,7 @@
                 <w:sz w:val="20"/>
                 <w:szCs w:val="20"/>
               </w:rPr>
-              <w:t xml:space="preserve">15, 30, 45 and 60.</w:t>
+              <w:t xml:space="preserve">7, 13, 19, 25 and 31. They go up by 6 (the 2 and the 3 from the two patterns meet every 6). For example 7 sticks make 3 triangles or 2 squares.</w:t>
             </w:r>
           </w:p>
         </w:tc>
@@ -46624,7 +46624,7 @@
                 <w:sz w:val="20"/>
                 <w:szCs w:val="20"/>
               </w:rPr>
-              <w:t xml:space="preserve">Workbook Challenge C3: Make 70¢ using exactly 4 coins from 5¢, 10¢, 20¢ and 50¢. How many ways are there?</w:t>
+              <w:t xml:space="preserve">Workbook Challenge C3: Pick any puzzle from today (a puzzle card or a worksheet question). Change ONE thing about it (a number, a rule or a condition) to make a new puzzle. Solve your new puzzle and say what changed in the answer, and why.</w:t>
             </w:r>
           </w:p>
         </w:tc>
@@ -46657,7 +46657,7 @@
                 <w:sz w:val="20"/>
                 <w:szCs w:val="20"/>
               </w:rPr>
-              <w:t xml:space="preserve">2 ways: 50¢ + 10¢ + 5¢ + 5¢ and 20¢ + 20¢ + 20¢ + 10¢.</w:t>
+              <w:t xml:space="preserve">Open. Check that the new puzzle can be solved and that the child explains the link between the change and the new answer. Example: change "Make 45¢ with exactly 3 coins" (20¢ + 20¢ + 5¢) to "Make 45¢ with exactly 4 coins": now the only way is 20¢ + 10¢ + 10¢ + 5¢.</w:t>
             </w:r>
           </w:p>
         </w:tc>
@@ -47472,7 +47472,7 @@
           <w:sz w:val="20"/>
           <w:szCs w:val="20"/>
         </w:rPr>
-        <w:t xml:space="preserve">(a) square  (b) 6 triangles</w:t>
+        <w:t xml:space="preserve">(a) square  (b) 3 triangles</w:t>
       </w:r>
     </w:p>
     <w:p>
@@ -47622,7 +47622,7 @@
           <w:sz w:val="20"/>
           <w:szCs w:val="20"/>
         </w:rPr>
-        <w:t xml:space="preserve">1) 6 bigger  2) 49  3) Two sets: 20¢ + 10¢ + 10¢ + 10¢ + 10¢, and 20¢ + 20¢ + 10¢ + 5¢ + 5¢</w:t>
+        <w:t xml:space="preserve">1) Two ways: five 2s, or 3 + 3 + 2 + 2  2) Ben, Mei, Ali, Sam  3) Three 10¢ and four 5¢</w:t>
       </w:r>
     </w:p>
     <w:p>

</xml_diff>